<commit_message>
Reworded instructions about modifying the 'super' call so that it was less ambiguous.
</commit_message>
<xml_diff>
--- a/Lab 10 - Inheritance.docx
+++ b/Lab 10 - Inheritance.docx
@@ -1,6 +1,6 @@
 
 <file path=word/document.xml><?xml version="1.0" encoding="utf-8"?>
-<w:document xmlns:wpc="http://schemas.microsoft.com/office/word/2010/wordprocessingCanvas" xmlns:cx="http://schemas.microsoft.com/office/drawing/2014/chartex" xmlns:cx1="http://schemas.microsoft.com/office/drawing/2015/9/8/chartex" xmlns:cx2="http://schemas.microsoft.com/office/drawing/2015/10/21/chartex" xmlns:cx3="http://schemas.microsoft.com/office/drawing/2016/5/9/chartex" xmlns:cx4="http://schemas.microsoft.com/office/drawing/2016/5/10/chartex" xmlns:cx5="http://schemas.microsoft.com/office/drawing/2016/5/11/chartex" xmlns:cx6="http://schemas.microsoft.com/office/drawing/2016/5/12/chartex" xmlns:cx7="http://schemas.microsoft.com/office/drawing/2016/5/13/chartex" xmlns:cx8="http://schemas.microsoft.com/office/drawing/2016/5/14/chartex" xmlns:mc="http://schemas.openxmlformats.org/markup-compatibility/2006" xmlns:aink="http://schemas.microsoft.com/office/drawing/2016/ink" xmlns:am3d="http://schemas.microsoft.com/office/drawing/2017/model3d" xmlns:o="urn:schemas-microsoft-com:office:office" xmlns:r="http://schemas.openxmlformats.org/officeDocument/2006/relationships" xmlns:m="http://schemas.openxmlformats.org/officeDocument/2006/math" xmlns:v="urn:schemas-microsoft-com:vml" xmlns:wp14="http://schemas.microsoft.com/office/word/2010/wordprocessingDrawing" xmlns:wp="http://schemas.openxmlformats.org/drawingml/2006/wordprocessingDrawing" xmlns:w10="urn:schemas-microsoft-com:office:word" xmlns:w="http://schemas.openxmlformats.org/wordprocessingml/2006/main" xmlns:w14="http://schemas.microsoft.com/office/word/2010/wordml" xmlns:w15="http://schemas.microsoft.com/office/word/2012/wordml" xmlns:w16cex="http://schemas.microsoft.com/office/word/2018/wordml/cex" xmlns:w16cid="http://schemas.microsoft.com/office/word/2016/wordml/cid" xmlns:w16="http://schemas.microsoft.com/office/word/2018/wordml" xmlns:w16se="http://schemas.microsoft.com/office/word/2015/wordml/symex" xmlns:wpg="http://schemas.microsoft.com/office/word/2010/wordprocessingGroup" xmlns:wpi="http://schemas.microsoft.com/office/word/2010/wordprocessingInk" xmlns:wne="http://schemas.microsoft.com/office/word/2006/wordml" xmlns:wps="http://schemas.microsoft.com/office/word/2010/wordprocessingShape" mc:Ignorable="w14 w15 w16se w16cid w16 w16cex wp14">
+<w:document xmlns:wpc="http://schemas.microsoft.com/office/word/2010/wordprocessingCanvas" xmlns:cx="http://schemas.microsoft.com/office/drawing/2014/chartex" xmlns:cx1="http://schemas.microsoft.com/office/drawing/2015/9/8/chartex" xmlns:cx2="http://schemas.microsoft.com/office/drawing/2015/10/21/chartex" xmlns:cx3="http://schemas.microsoft.com/office/drawing/2016/5/9/chartex" xmlns:cx4="http://schemas.microsoft.com/office/drawing/2016/5/10/chartex" xmlns:cx5="http://schemas.microsoft.com/office/drawing/2016/5/11/chartex" xmlns:cx6="http://schemas.microsoft.com/office/drawing/2016/5/12/chartex" xmlns:cx7="http://schemas.microsoft.com/office/drawing/2016/5/13/chartex" xmlns:cx8="http://schemas.microsoft.com/office/drawing/2016/5/14/chartex" xmlns:mc="http://schemas.openxmlformats.org/markup-compatibility/2006" xmlns:aink="http://schemas.microsoft.com/office/drawing/2016/ink" xmlns:am3d="http://schemas.microsoft.com/office/drawing/2017/model3d" xmlns:o="urn:schemas-microsoft-com:office:office" xmlns:oel="http://schemas.microsoft.com/office/2019/extlst" xmlns:r="http://schemas.openxmlformats.org/officeDocument/2006/relationships" xmlns:m="http://schemas.openxmlformats.org/officeDocument/2006/math" xmlns:v="urn:schemas-microsoft-com:vml" xmlns:wp14="http://schemas.microsoft.com/office/word/2010/wordprocessingDrawing" xmlns:wp="http://schemas.openxmlformats.org/drawingml/2006/wordprocessingDrawing" xmlns:w10="urn:schemas-microsoft-com:office:word" xmlns:w="http://schemas.openxmlformats.org/wordprocessingml/2006/main" xmlns:w14="http://schemas.microsoft.com/office/word/2010/wordml" xmlns:w15="http://schemas.microsoft.com/office/word/2012/wordml" xmlns:w16cex="http://schemas.microsoft.com/office/word/2018/wordml/cex" xmlns:w16cid="http://schemas.microsoft.com/office/word/2016/wordml/cid" xmlns:w16="http://schemas.microsoft.com/office/word/2018/wordml" xmlns:w16du="http://schemas.microsoft.com/office/word/2023/wordml/word16du" xmlns:w16sdtdh="http://schemas.microsoft.com/office/word/2020/wordml/sdtdatahash" xmlns:w16sdtfl="http://schemas.microsoft.com/office/word/2024/wordml/sdtformatlock" xmlns:w16se="http://schemas.microsoft.com/office/word/2015/wordml/symex" xmlns:wpg="http://schemas.microsoft.com/office/word/2010/wordprocessingGroup" xmlns:wpi="http://schemas.microsoft.com/office/word/2010/wordprocessingInk" xmlns:wne="http://schemas.microsoft.com/office/word/2006/wordml" xmlns:wps="http://schemas.microsoft.com/office/word/2010/wordprocessingShape" mc:Ignorable="w14 w15 w16se w16cid w16 w16cex w16sdtdh w16sdtfl w16du wp14">
   <w:body>
     <w:p>
       <w:pPr>
@@ -574,7 +574,6 @@
         <w:rPr>
           <w:rStyle w:val="HTMLTypewriter"/>
         </w:rPr>
-        <w:lastRenderedPageBreak/>
         <w:t>MargeFace</w:t>
       </w:r>
       <w:proofErr w:type="spellEnd"/>
@@ -1016,7 +1015,10 @@
         <w:spacing w:before="0" w:after="0"/>
       </w:pPr>
       <w:r>
-        <w:t xml:space="preserve">Update the constructor so that the width is multiplied by 0.75 and the height is multiplied by 1.25 before being passed into </w:t>
+        <w:t xml:space="preserve">Update the constructor so that </w:t>
+      </w:r>
+      <w:r>
+        <w:t xml:space="preserve">values passed into </w:t>
       </w:r>
       <w:r>
         <w:rPr>
@@ -1024,6 +1026,21 @@
           <w:sz w:val="20"/>
         </w:rPr>
         <w:t>super</w:t>
+      </w:r>
+      <w:r>
+        <w:t xml:space="preserve"> are respectively </w:t>
+      </w:r>
+      <w:r>
+        <w:t>0.75</w:t>
+      </w:r>
+      <w:r>
+        <w:t xml:space="preserve"> times the width and </w:t>
+      </w:r>
+      <w:r>
+        <w:t xml:space="preserve">1.25 </w:t>
+      </w:r>
+      <w:r>
+        <w:t>times the height</w:t>
       </w:r>
       <w:r>
         <w:t>.</w:t>
@@ -1359,7 +1376,6 @@
           <w:rFonts w:ascii="Courier New" w:hAnsi="Courier New"/>
           <w:sz w:val="20"/>
         </w:rPr>
-        <w:lastRenderedPageBreak/>
         <w:t>Simpson</w:t>
       </w:r>
       <w:r>
@@ -2043,7 +2059,6 @@
         <w:rPr>
           <w:rFonts w:ascii="Times" w:hAnsi="Times"/>
         </w:rPr>
-        <w:lastRenderedPageBreak/>
         <w:t xml:space="preserve">Part 3: Create </w:t>
       </w:r>
       <w:r>
@@ -2790,7 +2805,6 @@
         <w:rPr>
           <w:rFonts w:ascii="Times" w:hAnsi="Times"/>
         </w:rPr>
-        <w:lastRenderedPageBreak/>
         <w:t>EC</w:t>
       </w:r>
       <w:r>
@@ -3154,7 +3168,7 @@
 </file>
 
 <file path=word/numbering.xml><?xml version="1.0" encoding="utf-8"?>
-<w:numbering xmlns:wpc="http://schemas.microsoft.com/office/word/2010/wordprocessingCanvas" xmlns:cx="http://schemas.microsoft.com/office/drawing/2014/chartex" xmlns:cx1="http://schemas.microsoft.com/office/drawing/2015/9/8/chartex" xmlns:cx2="http://schemas.microsoft.com/office/drawing/2015/10/21/chartex" xmlns:cx3="http://schemas.microsoft.com/office/drawing/2016/5/9/chartex" xmlns:cx4="http://schemas.microsoft.com/office/drawing/2016/5/10/chartex" xmlns:cx5="http://schemas.microsoft.com/office/drawing/2016/5/11/chartex" xmlns:cx6="http://schemas.microsoft.com/office/drawing/2016/5/12/chartex" xmlns:cx7="http://schemas.microsoft.com/office/drawing/2016/5/13/chartex" xmlns:cx8="http://schemas.microsoft.com/office/drawing/2016/5/14/chartex" xmlns:mc="http://schemas.openxmlformats.org/markup-compatibility/2006" xmlns:aink="http://schemas.microsoft.com/office/drawing/2016/ink" xmlns:am3d="http://schemas.microsoft.com/office/drawing/2017/model3d" xmlns:o="urn:schemas-microsoft-com:office:office" xmlns:r="http://schemas.openxmlformats.org/officeDocument/2006/relationships" xmlns:m="http://schemas.openxmlformats.org/officeDocument/2006/math" xmlns:v="urn:schemas-microsoft-com:vml" xmlns:wp14="http://schemas.microsoft.com/office/word/2010/wordprocessingDrawing" xmlns:wp="http://schemas.openxmlformats.org/drawingml/2006/wordprocessingDrawing" xmlns:w10="urn:schemas-microsoft-com:office:word" xmlns:w="http://schemas.openxmlformats.org/wordprocessingml/2006/main" xmlns:w14="http://schemas.microsoft.com/office/word/2010/wordml" xmlns:w15="http://schemas.microsoft.com/office/word/2012/wordml" xmlns:w16cex="http://schemas.microsoft.com/office/word/2018/wordml/cex" xmlns:w16cid="http://schemas.microsoft.com/office/word/2016/wordml/cid" xmlns:w16="http://schemas.microsoft.com/office/word/2018/wordml" xmlns:w16se="http://schemas.microsoft.com/office/word/2015/wordml/symex" xmlns:wpg="http://schemas.microsoft.com/office/word/2010/wordprocessingGroup" xmlns:wpi="http://schemas.microsoft.com/office/word/2010/wordprocessingInk" xmlns:wne="http://schemas.microsoft.com/office/word/2006/wordml" xmlns:wps="http://schemas.microsoft.com/office/word/2010/wordprocessingShape" mc:Ignorable="w14 w15 w16se w16cid w16 w16cex wp14">
+<w:numbering xmlns:wpc="http://schemas.microsoft.com/office/word/2010/wordprocessingCanvas" xmlns:cx="http://schemas.microsoft.com/office/drawing/2014/chartex" xmlns:cx1="http://schemas.microsoft.com/office/drawing/2015/9/8/chartex" xmlns:cx2="http://schemas.microsoft.com/office/drawing/2015/10/21/chartex" xmlns:cx3="http://schemas.microsoft.com/office/drawing/2016/5/9/chartex" xmlns:cx4="http://schemas.microsoft.com/office/drawing/2016/5/10/chartex" xmlns:cx5="http://schemas.microsoft.com/office/drawing/2016/5/11/chartex" xmlns:cx6="http://schemas.microsoft.com/office/drawing/2016/5/12/chartex" xmlns:cx7="http://schemas.microsoft.com/office/drawing/2016/5/13/chartex" xmlns:cx8="http://schemas.microsoft.com/office/drawing/2016/5/14/chartex" xmlns:mc="http://schemas.openxmlformats.org/markup-compatibility/2006" xmlns:aink="http://schemas.microsoft.com/office/drawing/2016/ink" xmlns:am3d="http://schemas.microsoft.com/office/drawing/2017/model3d" xmlns:o="urn:schemas-microsoft-com:office:office" xmlns:oel="http://schemas.microsoft.com/office/2019/extlst" xmlns:r="http://schemas.openxmlformats.org/officeDocument/2006/relationships" xmlns:m="http://schemas.openxmlformats.org/officeDocument/2006/math" xmlns:v="urn:schemas-microsoft-com:vml" xmlns:wp14="http://schemas.microsoft.com/office/word/2010/wordprocessingDrawing" xmlns:wp="http://schemas.openxmlformats.org/drawingml/2006/wordprocessingDrawing" xmlns:w10="urn:schemas-microsoft-com:office:word" xmlns:w="http://schemas.openxmlformats.org/wordprocessingml/2006/main" xmlns:w14="http://schemas.microsoft.com/office/word/2010/wordml" xmlns:w15="http://schemas.microsoft.com/office/word/2012/wordml" xmlns:w16cex="http://schemas.microsoft.com/office/word/2018/wordml/cex" xmlns:w16cid="http://schemas.microsoft.com/office/word/2016/wordml/cid" xmlns:w16="http://schemas.microsoft.com/office/word/2018/wordml" xmlns:w16du="http://schemas.microsoft.com/office/word/2023/wordml/word16du" xmlns:w16sdtdh="http://schemas.microsoft.com/office/word/2020/wordml/sdtdatahash" xmlns:w16sdtfl="http://schemas.microsoft.com/office/word/2024/wordml/sdtformatlock" xmlns:w16se="http://schemas.microsoft.com/office/word/2015/wordml/symex" xmlns:wpg="http://schemas.microsoft.com/office/word/2010/wordprocessingGroup" xmlns:wpi="http://schemas.microsoft.com/office/word/2010/wordprocessingInk" xmlns:wne="http://schemas.microsoft.com/office/word/2006/wordml" xmlns:wps="http://schemas.microsoft.com/office/word/2010/wordprocessingShape" mc:Ignorable="w14 w15 w16se w16cid w16 w16cex w16sdtdh w16sdtfl w16du wp14">
   <w:abstractNum w:abstractNumId="0" w15:restartNumberingAfterBreak="0">
     <w:nsid w:val="110817D3"/>
     <w:multiLevelType w:val="multilevel"/>
@@ -4514,10 +4528,10 @@
       </w:pPr>
     </w:lvl>
   </w:abstractNum>
-  <w:num w:numId="1">
+  <w:num w:numId="1" w16cid:durableId="1007364777">
     <w:abstractNumId w:val="2"/>
   </w:num>
-  <w:num w:numId="2">
+  <w:num w:numId="2" w16cid:durableId="779372972">
     <w:abstractNumId w:val="2"/>
     <w:lvlOverride w:ilvl="0"/>
     <w:lvlOverride w:ilvl="1"/>
@@ -4543,10 +4557,10 @@
       <w:startOverride w:val="1"/>
     </w:lvlOverride>
   </w:num>
-  <w:num w:numId="3">
+  <w:num w:numId="3" w16cid:durableId="1152671233">
     <w:abstractNumId w:val="9"/>
   </w:num>
-  <w:num w:numId="4">
+  <w:num w:numId="4" w16cid:durableId="2041516954">
     <w:abstractNumId w:val="9"/>
     <w:lvlOverride w:ilvl="0"/>
     <w:lvlOverride w:ilvl="1">
@@ -4574,16 +4588,16 @@
       <w:startOverride w:val="1"/>
     </w:lvlOverride>
   </w:num>
-  <w:num w:numId="5">
+  <w:num w:numId="5" w16cid:durableId="2022775668">
     <w:abstractNumId w:val="0"/>
   </w:num>
-  <w:num w:numId="6">
+  <w:num w:numId="6" w16cid:durableId="1326936328">
     <w:abstractNumId w:val="0"/>
   </w:num>
-  <w:num w:numId="7">
+  <w:num w:numId="7" w16cid:durableId="590511214">
     <w:abstractNumId w:val="7"/>
   </w:num>
-  <w:num w:numId="8">
+  <w:num w:numId="8" w16cid:durableId="1258709341">
     <w:abstractNumId w:val="7"/>
     <w:lvlOverride w:ilvl="0"/>
     <w:lvlOverride w:ilvl="1"/>
@@ -4609,10 +4623,10 @@
       <w:startOverride w:val="1"/>
     </w:lvlOverride>
   </w:num>
-  <w:num w:numId="9">
+  <w:num w:numId="9" w16cid:durableId="137385343">
     <w:abstractNumId w:val="4"/>
   </w:num>
-  <w:num w:numId="10">
+  <w:num w:numId="10" w16cid:durableId="1103187653">
     <w:abstractNumId w:val="4"/>
     <w:lvlOverride w:ilvl="0"/>
     <w:lvlOverride w:ilvl="1">
@@ -4640,10 +4654,10 @@
       <w:startOverride w:val="1"/>
     </w:lvlOverride>
   </w:num>
-  <w:num w:numId="11">
+  <w:num w:numId="11" w16cid:durableId="104735473">
     <w:abstractNumId w:val="6"/>
   </w:num>
-  <w:num w:numId="12">
+  <w:num w:numId="12" w16cid:durableId="108016027">
     <w:abstractNumId w:val="6"/>
     <w:lvlOverride w:ilvl="0"/>
     <w:lvlOverride w:ilvl="1">
@@ -4671,32 +4685,32 @@
       <w:startOverride w:val="1"/>
     </w:lvlOverride>
   </w:num>
-  <w:num w:numId="13">
+  <w:num w:numId="13" w16cid:durableId="933711567">
     <w:abstractNumId w:val="11"/>
   </w:num>
-  <w:num w:numId="14">
+  <w:num w:numId="14" w16cid:durableId="331421904">
     <w:abstractNumId w:val="11"/>
   </w:num>
-  <w:num w:numId="15">
+  <w:num w:numId="15" w16cid:durableId="438333475">
     <w:abstractNumId w:val="8"/>
   </w:num>
-  <w:num w:numId="16">
+  <w:num w:numId="16" w16cid:durableId="447742637">
     <w:abstractNumId w:val="3"/>
   </w:num>
-  <w:num w:numId="17">
+  <w:num w:numId="17" w16cid:durableId="1497261887">
     <w:abstractNumId w:val="5"/>
   </w:num>
-  <w:num w:numId="18">
+  <w:num w:numId="18" w16cid:durableId="769929046">
     <w:abstractNumId w:val="1"/>
   </w:num>
-  <w:num w:numId="19">
+  <w:num w:numId="19" w16cid:durableId="1619599928">
     <w:abstractNumId w:val="10"/>
   </w:num>
 </w:numbering>
 </file>
 
 <file path=word/styles.xml><?xml version="1.0" encoding="utf-8"?>
-<w:styles xmlns:mc="http://schemas.openxmlformats.org/markup-compatibility/2006" xmlns:r="http://schemas.openxmlformats.org/officeDocument/2006/relationships" xmlns:w="http://schemas.openxmlformats.org/wordprocessingml/2006/main" xmlns:w14="http://schemas.microsoft.com/office/word/2010/wordml" xmlns:w15="http://schemas.microsoft.com/office/word/2012/wordml" xmlns:w16cex="http://schemas.microsoft.com/office/word/2018/wordml/cex" xmlns:w16cid="http://schemas.microsoft.com/office/word/2016/wordml/cid" xmlns:w16="http://schemas.microsoft.com/office/word/2018/wordml" xmlns:w16se="http://schemas.microsoft.com/office/word/2015/wordml/symex" mc:Ignorable="w14 w15 w16se w16cid w16 w16cex">
+<w:styles xmlns:mc="http://schemas.openxmlformats.org/markup-compatibility/2006" xmlns:r="http://schemas.openxmlformats.org/officeDocument/2006/relationships" xmlns:w="http://schemas.openxmlformats.org/wordprocessingml/2006/main" xmlns:w14="http://schemas.microsoft.com/office/word/2010/wordml" xmlns:w15="http://schemas.microsoft.com/office/word/2012/wordml" xmlns:w16cex="http://schemas.microsoft.com/office/word/2018/wordml/cex" xmlns:w16cid="http://schemas.microsoft.com/office/word/2016/wordml/cid" xmlns:w16="http://schemas.microsoft.com/office/word/2018/wordml" xmlns:w16du="http://schemas.microsoft.com/office/word/2023/wordml/word16du" xmlns:w16sdtdh="http://schemas.microsoft.com/office/word/2020/wordml/sdtdatahash" xmlns:w16sdtfl="http://schemas.microsoft.com/office/word/2024/wordml/sdtformatlock" xmlns:w16se="http://schemas.microsoft.com/office/word/2015/wordml/symex" mc:Ignorable="w14 w15 w16se w16cid w16 w16cex w16sdtdh w16sdtfl w16du">
   <w:docDefaults>
     <w:rPrDefault>
       <w:rPr>

</xml_diff>

<commit_message>
Removed reference in Checkpoint 1 to "happy faces", which are from an older version of this lab. Replaced with "Simpson face", which is what it should be.
</commit_message>
<xml_diff>
--- a/Lab 10 - Inheritance.docx
+++ b/Lab 10 - Inheritance.docx
@@ -1500,7 +1500,31 @@
         <w:rPr>
           <w:b/>
         </w:rPr>
-        <w:t xml:space="preserve"> Show your lab instructor or assistant that the two happy faces now look as described above.</w:t>
+        <w:t xml:space="preserve"> Show your lab instructor or assistant that the </w:t>
+      </w:r>
+      <w:r>
+        <w:rPr>
+          <w:b/>
+        </w:rPr>
+        <w:t>Simpson face</w:t>
+      </w:r>
+      <w:r>
+        <w:rPr>
+          <w:b/>
+        </w:rPr>
+        <w:t xml:space="preserve"> now look</w:t>
+      </w:r>
+      <w:r>
+        <w:rPr>
+          <w:b/>
+        </w:rPr>
+        <w:t>s</w:t>
+      </w:r>
+      <w:r>
+        <w:rPr>
+          <w:b/>
+        </w:rPr>
+        <w:t xml:space="preserve"> as described above.</w:t>
       </w:r>
       <w:r>
         <w:t xml:space="preserve"> </w:t>

</xml_diff>

<commit_message>
Draw axes behind each face to help with choosing arguments for the pixelX, pixelY, distX, and distY methods.
</commit_message>
<xml_diff>
--- a/Lab 10 - Inheritance.docx
+++ b/Lab 10 - Inheritance.docx
@@ -282,6 +282,34 @@
       <w:r>
         <w:t>the current object's head (e.g., 20% of the way across the face). These will be handy when drawing facial features.</w:t>
       </w:r>
+      <w:r>
+        <w:t xml:space="preserve"> The axes drawn by </w:t>
+      </w:r>
+      <w:proofErr w:type="spellStart"/>
+      <w:proofErr w:type="gramStart"/>
+      <w:r>
+        <w:rPr>
+          <w:rStyle w:val="HTMLTypewriter"/>
+        </w:rPr>
+        <w:t>drawAxes</w:t>
+      </w:r>
+      <w:proofErr w:type="spellEnd"/>
+      <w:r>
+        <w:rPr>
+          <w:rStyle w:val="HTMLTypewriter"/>
+        </w:rPr>
+        <w:t>(</w:t>
+      </w:r>
+      <w:proofErr w:type="gramEnd"/>
+      <w:r>
+        <w:rPr>
+          <w:rStyle w:val="HTMLTypewriter"/>
+        </w:rPr>
+        <w:t>)</w:t>
+      </w:r>
+      <w:r>
+        <w:t xml:space="preserve"> show the coordinates that those methods use. </w:t>
+      </w:r>
     </w:p>
     <w:p>
       <w:pPr>
@@ -558,6 +586,7 @@
         <w:rPr>
           <w:rStyle w:val="HTMLTypewriter"/>
         </w:rPr>
+        <w:lastRenderedPageBreak/>
         <w:t>HomerFace</w:t>
       </w:r>
       <w:proofErr w:type="spellEnd"/>
@@ -938,18 +967,119 @@
         <w:spacing w:before="0" w:after="0"/>
       </w:pPr>
       <w:r>
-        <w:t xml:space="preserve">A </w:t>
-      </w:r>
-      <w:proofErr w:type="spellStart"/>
-      <w:r>
+        <w:t>Set the head to the official “Simpson yellow”</w:t>
+      </w:r>
+    </w:p>
+    <w:p>
+      <w:pPr>
+        <w:pStyle w:val="NormalWeb"/>
+        <w:numPr>
+          <w:ilvl w:val="1"/>
+          <w:numId w:val="16"/>
+        </w:numPr>
+        <w:spacing w:before="0" w:after="0"/>
+      </w:pPr>
+      <w:r>
+        <w:t xml:space="preserve">Override the </w:t>
+      </w:r>
+      <w:proofErr w:type="spellStart"/>
+      <w:r>
+        <w:rPr>
+          <w:rFonts w:ascii="Courier New" w:hAnsi="Courier New"/>
+          <w:sz w:val="20"/>
+        </w:rPr>
+        <w:t>headColor</w:t>
+      </w:r>
+      <w:proofErr w:type="spellEnd"/>
+      <w:r>
+        <w:t xml:space="preserve"> method from the </w:t>
+      </w:r>
+      <w:r>
+        <w:rPr>
+          <w:rFonts w:ascii="Courier New" w:hAnsi="Courier New" w:cs="Courier New"/>
+          <w:sz w:val="20"/>
+        </w:rPr>
+        <w:t>Face</w:t>
+      </w:r>
+      <w:r>
+        <w:t xml:space="preserve"> class by defining a </w:t>
+      </w:r>
+      <w:r>
+        <w:rPr>
+          <w:rFonts w:ascii="Courier New" w:hAnsi="Courier New"/>
+          <w:sz w:val="20"/>
+        </w:rPr>
+        <w:t>protected</w:t>
+      </w:r>
+      <w:r>
+        <w:t xml:space="preserve"> method called </w:t>
+      </w:r>
+      <w:proofErr w:type="spellStart"/>
+      <w:r>
+        <w:rPr>
+          <w:rFonts w:ascii="Courier New" w:hAnsi="Courier New"/>
+          <w:sz w:val="20"/>
+        </w:rPr>
+        <w:t>headColor</w:t>
+      </w:r>
+      <w:proofErr w:type="spellEnd"/>
+      <w:r>
+        <w:rPr>
+          <w:rFonts w:ascii="Courier New" w:hAnsi="Courier New"/>
+          <w:sz w:val="20"/>
+        </w:rPr>
+        <w:t xml:space="preserve"> </w:t>
+      </w:r>
+      <w:r>
+        <w:t>in the</w:t>
+      </w:r>
+      <w:r>
+        <w:rPr>
+          <w:rFonts w:ascii="Courier New" w:hAnsi="Courier New"/>
+          <w:sz w:val="20"/>
+        </w:rPr>
+        <w:t xml:space="preserve"> </w:t>
+      </w:r>
+      <w:proofErr w:type="spellStart"/>
+      <w:r>
+        <w:rPr>
+          <w:rFonts w:ascii="Courier New" w:hAnsi="Courier New"/>
+          <w:sz w:val="20"/>
+        </w:rPr>
         <w:t>SimpsonFace</w:t>
       </w:r>
       <w:proofErr w:type="spellEnd"/>
       <w:r>
-        <w:t xml:space="preserve"> is </w:t>
-      </w:r>
-      <w:r>
-        <w:t xml:space="preserve">narrower and longer </w:t>
+        <w:rPr>
+          <w:rFonts w:ascii="Courier New" w:hAnsi="Courier New"/>
+          <w:sz w:val="20"/>
+        </w:rPr>
+        <w:t xml:space="preserve"> </w:t>
+      </w:r>
+      <w:r>
+        <w:t>class</w:t>
+      </w:r>
+      <w:r>
+        <w:t xml:space="preserve"> that takes no parameters and </w:t>
+      </w:r>
+      <w:r>
+        <w:rPr>
+          <w:iCs/>
+        </w:rPr>
+        <w:t>returns</w:t>
+      </w:r>
+      <w:r>
+        <w:t xml:space="preserve"> a </w:t>
+      </w:r>
+      <w:r>
+        <w:rPr>
+          <w:rFonts w:ascii="Courier New" w:hAnsi="Courier New"/>
+          <w:sz w:val="20"/>
+        </w:rPr>
+        <w:t xml:space="preserve">Color </w:t>
+      </w:r>
+      <w:r>
+        <w:t xml:space="preserve">object with RGB values of (254, 212, 29). </w:t>
       </w:r>
     </w:p>
     <w:p>
@@ -962,7 +1092,32 @@
         <w:spacing w:before="0" w:after="0"/>
       </w:pPr>
       <w:r>
-        <w:t>The head color is yellow</w:t>
+        <w:t>There is no hair</w:t>
+      </w:r>
+    </w:p>
+    <w:p>
+      <w:pPr>
+        <w:pStyle w:val="NormalWeb"/>
+        <w:numPr>
+          <w:ilvl w:val="1"/>
+          <w:numId w:val="16"/>
+        </w:numPr>
+        <w:spacing w:before="0" w:after="0"/>
+      </w:pPr>
+      <w:r>
+        <w:t xml:space="preserve">Do this by overriding the </w:t>
+      </w:r>
+      <w:proofErr w:type="spellStart"/>
+      <w:r>
+        <w:rPr>
+          <w:rFonts w:ascii="Courier New" w:hAnsi="Courier New" w:cs="Courier New"/>
+          <w:sz w:val="20"/>
+        </w:rPr>
+        <w:t>drawHair</w:t>
+      </w:r>
+      <w:proofErr w:type="spellEnd"/>
+      <w:r>
+        <w:t xml:space="preserve"> method. </w:t>
       </w:r>
     </w:p>
     <w:p>
@@ -975,34 +1130,59 @@
         <w:spacing w:before="0" w:after="0"/>
       </w:pPr>
       <w:r>
-        <w:t>The mouth is a black smile</w:t>
+        <w:t xml:space="preserve">A </w:t>
+      </w:r>
+      <w:proofErr w:type="spellStart"/>
+      <w:r>
+        <w:t>SimpsonFace</w:t>
+      </w:r>
+      <w:proofErr w:type="spellEnd"/>
+      <w:r>
+        <w:t xml:space="preserve"> is narrower and longer </w:t>
       </w:r>
     </w:p>
     <w:p>
       <w:pPr>
         <w:pStyle w:val="NormalWeb"/>
+        <w:numPr>
+          <w:ilvl w:val="1"/>
+          <w:numId w:val="16"/>
+        </w:numPr>
         <w:spacing w:before="0" w:after="0"/>
       </w:pPr>
       <w:r>
-        <w:t xml:space="preserve">You should </w:t>
-      </w:r>
-      <w:r>
-        <w:t>update</w:t>
-      </w:r>
-      <w:r>
-        <w:t xml:space="preserve"> the </w:t>
-      </w:r>
-      <w:proofErr w:type="spellStart"/>
-      <w:r>
-        <w:rPr>
-          <w:rFonts w:ascii="Courier New" w:hAnsi="Courier New"/>
-          <w:sz w:val="20"/>
-        </w:rPr>
-        <w:t>SimpsonFace</w:t>
-      </w:r>
-      <w:proofErr w:type="spellEnd"/>
-      <w:r>
-        <w:t xml:space="preserve"> class using the following steps:</w:t>
+        <w:t xml:space="preserve">Update the constructor so that </w:t>
+      </w:r>
+      <w:r>
+        <w:t xml:space="preserve">values passed into </w:t>
+      </w:r>
+      <w:r>
+        <w:rPr>
+          <w:rFonts w:ascii="Courier New" w:hAnsi="Courier New" w:cs="Courier New"/>
+          <w:sz w:val="20"/>
+        </w:rPr>
+        <w:t>super</w:t>
+      </w:r>
+      <w:r>
+        <w:t xml:space="preserve"> are respectively </w:t>
+      </w:r>
+      <w:r>
+        <w:t>0.75</w:t>
+      </w:r>
+      <w:r>
+        <w:t xml:space="preserve"> times the width and </w:t>
+      </w:r>
+      <w:r>
+        <w:t xml:space="preserve">1.25 </w:t>
+      </w:r>
+      <w:r>
+        <w:t>times the height</w:t>
+      </w:r>
+      <w:r>
+        <w:t>.</w:t>
+      </w:r>
+      <w:r>
+        <w:t xml:space="preserve"> You will have to typecast to comply with the expected parameter types. </w:t>
       </w:r>
     </w:p>
     <w:p>
@@ -1010,51 +1190,20 @@
         <w:pStyle w:val="NormalWeb"/>
         <w:numPr>
           <w:ilvl w:val="0"/>
-          <w:numId w:val="15"/>
+          <w:numId w:val="16"/>
         </w:numPr>
         <w:spacing w:before="0" w:after="0"/>
       </w:pPr>
       <w:r>
-        <w:t xml:space="preserve">Update the constructor so that </w:t>
-      </w:r>
-      <w:r>
-        <w:t xml:space="preserve">values passed into </w:t>
-      </w:r>
-      <w:r>
-        <w:rPr>
-          <w:rFonts w:ascii="Courier New" w:hAnsi="Courier New" w:cs="Courier New"/>
-          <w:sz w:val="20"/>
-        </w:rPr>
-        <w:t>super</w:t>
-      </w:r>
-      <w:r>
-        <w:t xml:space="preserve"> are respectively </w:t>
-      </w:r>
-      <w:r>
-        <w:t>0.75</w:t>
-      </w:r>
-      <w:r>
-        <w:t xml:space="preserve"> times the width and </w:t>
-      </w:r>
-      <w:r>
-        <w:t xml:space="preserve">1.25 </w:t>
-      </w:r>
-      <w:r>
-        <w:t>times the height</w:t>
-      </w:r>
-      <w:r>
-        <w:t>.</w:t>
-      </w:r>
-      <w:r>
-        <w:t xml:space="preserve"> You will have to typecast to comply with the expected parameter types. </w:t>
+        <w:t>The mouth is a black smile</w:t>
       </w:r>
     </w:p>
     <w:p>
       <w:pPr>
         <w:pStyle w:val="NormalWeb"/>
         <w:numPr>
-          <w:ilvl w:val="0"/>
-          <w:numId w:val="15"/>
+          <w:ilvl w:val="1"/>
+          <w:numId w:val="16"/>
         </w:numPr>
         <w:spacing w:before="0" w:after="0"/>
       </w:pPr>
@@ -1165,8 +1314,8 @@
       <w:pPr>
         <w:pStyle w:val="NormalWeb"/>
         <w:numPr>
-          <w:ilvl w:val="0"/>
-          <w:numId w:val="15"/>
+          <w:ilvl w:val="1"/>
+          <w:numId w:val="16"/>
         </w:numPr>
         <w:spacing w:before="0" w:after="0"/>
       </w:pPr>
@@ -1228,7 +1377,15 @@
         <w:t>Polygon2</w:t>
       </w:r>
       <w:r>
-        <w:t xml:space="preserve"> class with regard to the constructor and methods to scale and rotate the </w:t>
+        <w:t xml:space="preserve"> class </w:t>
+      </w:r>
+      <w:proofErr w:type="gramStart"/>
+      <w:r>
+        <w:t>with regard to</w:t>
+      </w:r>
+      <w:proofErr w:type="gramEnd"/>
+      <w:r>
+        <w:t xml:space="preserve"> the constructor and methods to scale and rotate the </w:t>
       </w:r>
       <w:r>
         <w:rPr>
@@ -1241,6 +1398,7 @@
         <w:t xml:space="preserve"> object.) The object returned should fit in the face. Recall that the method call </w:t>
       </w:r>
       <w:proofErr w:type="spellStart"/>
+      <w:proofErr w:type="gramStart"/>
       <w:r>
         <w:rPr>
           <w:rFonts w:ascii="Courier New" w:hAnsi="Courier New"/>
@@ -1254,18 +1412,30 @@
           <w:rFonts w:ascii="Courier New" w:hAnsi="Courier New"/>
           <w:sz w:val="20"/>
         </w:rPr>
-        <w:t>(20)</w:t>
-      </w:r>
-      <w:r>
-        <w:t xml:space="preserve"> returns the x-coordinate location that is 20% from the left edge of the face’s bounding box. </w:t>
+        <w:t>(</w:t>
+      </w:r>
+      <w:proofErr w:type="gramEnd"/>
+      <w:r>
+        <w:rPr>
+          <w:rFonts w:ascii="Courier New" w:hAnsi="Courier New"/>
+          <w:sz w:val="20"/>
+        </w:rPr>
+        <w:t>20)</w:t>
+      </w:r>
+      <w:r>
+        <w:t xml:space="preserve"> returns the </w:t>
+      </w:r>
+      <w:r>
+        <w:lastRenderedPageBreak/>
+        <w:t xml:space="preserve">x-coordinate location that is 20% from the left edge of the face’s bounding box. </w:t>
       </w:r>
     </w:p>
     <w:p>
       <w:pPr>
         <w:pStyle w:val="NormalWeb"/>
         <w:numPr>
-          <w:ilvl w:val="0"/>
-          <w:numId w:val="15"/>
+          <w:ilvl w:val="1"/>
+          <w:numId w:val="16"/>
         </w:numPr>
         <w:spacing w:before="0" w:after="0"/>
       </w:pPr>
@@ -1390,6 +1560,7 @@
         <w:t xml:space="preserve"> class should set the color of the graphics pen to </w:t>
       </w:r>
       <w:proofErr w:type="spellStart"/>
+      <w:proofErr w:type="gramStart"/>
       <w:r>
         <w:rPr>
           <w:rFonts w:ascii="Courier New" w:hAnsi="Courier New"/>
@@ -1398,6 +1569,7 @@
         <w:t>this.mouthColor</w:t>
       </w:r>
       <w:proofErr w:type="spellEnd"/>
+      <w:proofErr w:type="gramEnd"/>
       <w:r>
         <w:rPr>
           <w:rFonts w:ascii="Courier New" w:hAnsi="Courier New"/>
@@ -1419,6 +1591,7 @@
         <w:t xml:space="preserve"> variable and assign it to the result of calling </w:t>
       </w:r>
       <w:proofErr w:type="spellStart"/>
+      <w:proofErr w:type="gramStart"/>
       <w:r>
         <w:rPr>
           <w:rFonts w:ascii="Courier New" w:hAnsi="Courier New"/>
@@ -1432,7 +1605,15 @@
           <w:rFonts w:ascii="Courier New" w:hAnsi="Courier New"/>
           <w:sz w:val="20"/>
         </w:rPr>
-        <w:t>()</w:t>
+        <w:t>(</w:t>
+      </w:r>
+      <w:proofErr w:type="gramEnd"/>
+      <w:r>
+        <w:rPr>
+          <w:rFonts w:ascii="Courier New" w:hAnsi="Courier New"/>
+          <w:sz w:val="20"/>
+        </w:rPr>
+        <w:t>)</w:t>
       </w:r>
       <w:r>
         <w:t xml:space="preserve">. Finally, the method should draw the mouth to the </w:t>
@@ -1588,7 +1769,7 @@
         <w:spacing w:before="0" w:after="0"/>
       </w:pPr>
       <w:r>
-        <w:t>Set the head to the official “Simpson yellow”</w:t>
+        <w:t>The eye whites are much larger and close together</w:t>
       </w:r>
     </w:p>
     <w:p>
@@ -1606,101 +1787,30 @@
       <w:proofErr w:type="spellStart"/>
       <w:r>
         <w:rPr>
-          <w:rFonts w:ascii="Courier New" w:hAnsi="Courier New"/>
-          <w:sz w:val="20"/>
-        </w:rPr>
-        <w:t>headColor</w:t>
-      </w:r>
-      <w:proofErr w:type="spellEnd"/>
-      <w:r>
-        <w:t xml:space="preserve"> method from the </w:t>
-      </w:r>
-      <w:r>
-        <w:rPr>
           <w:rFonts w:ascii="Courier New" w:hAnsi="Courier New" w:cs="Courier New"/>
           <w:sz w:val="20"/>
         </w:rPr>
+        <w:t>drawEyeWhites</w:t>
+      </w:r>
+      <w:proofErr w:type="spellEnd"/>
+      <w:r>
+        <w:t xml:space="preserve"> method </w:t>
+      </w:r>
+      <w:r>
+        <w:t>from</w:t>
+      </w:r>
+      <w:r>
+        <w:t xml:space="preserve"> the </w:t>
+      </w:r>
+      <w:r>
+        <w:rPr>
+          <w:rFonts w:ascii="Courier New" w:hAnsi="Courier New" w:cs="Courier New"/>
+          <w:sz w:val="20"/>
+        </w:rPr>
         <w:t>Face</w:t>
       </w:r>
       <w:r>
-        <w:t xml:space="preserve"> class by defining a </w:t>
-      </w:r>
-      <w:r>
-        <w:rPr>
-          <w:rFonts w:ascii="Courier New" w:hAnsi="Courier New"/>
-          <w:sz w:val="20"/>
-        </w:rPr>
-        <w:t>protected</w:t>
-      </w:r>
-      <w:r>
-        <w:t xml:space="preserve"> method called </w:t>
-      </w:r>
-      <w:proofErr w:type="spellStart"/>
-      <w:r>
-        <w:rPr>
-          <w:rFonts w:ascii="Courier New" w:hAnsi="Courier New"/>
-          <w:sz w:val="20"/>
-        </w:rPr>
-        <w:t>headColor</w:t>
-      </w:r>
-      <w:proofErr w:type="spellEnd"/>
-      <w:r>
-        <w:rPr>
-          <w:rFonts w:ascii="Courier New" w:hAnsi="Courier New"/>
-          <w:sz w:val="20"/>
-        </w:rPr>
-        <w:t xml:space="preserve"> </w:t>
-      </w:r>
-      <w:r>
-        <w:t>in the</w:t>
-      </w:r>
-      <w:r>
-        <w:rPr>
-          <w:rFonts w:ascii="Courier New" w:hAnsi="Courier New"/>
-          <w:sz w:val="20"/>
-        </w:rPr>
-        <w:t xml:space="preserve"> </w:t>
-      </w:r>
-      <w:proofErr w:type="spellStart"/>
-      <w:r>
-        <w:rPr>
-          <w:rFonts w:ascii="Courier New" w:hAnsi="Courier New"/>
-          <w:sz w:val="20"/>
-        </w:rPr>
-        <w:t>SimpsonFace</w:t>
-      </w:r>
-      <w:proofErr w:type="spellEnd"/>
-      <w:r>
-        <w:rPr>
-          <w:rFonts w:ascii="Courier New" w:hAnsi="Courier New"/>
-          <w:sz w:val="20"/>
-        </w:rPr>
-        <w:t xml:space="preserve"> </w:t>
-      </w:r>
-      <w:r>
-        <w:t>class</w:t>
-      </w:r>
-      <w:r>
-        <w:t xml:space="preserve"> that takes no parameters and </w:t>
-      </w:r>
-      <w:r>
-        <w:rPr>
-          <w:iCs/>
-        </w:rPr>
-        <w:t>returns</w:t>
-      </w:r>
-      <w:r>
-        <w:t xml:space="preserve"> a </w:t>
-      </w:r>
-      <w:r>
-        <w:rPr>
-          <w:rFonts w:ascii="Courier New" w:hAnsi="Courier New"/>
-          <w:sz w:val="20"/>
-        </w:rPr>
-        <w:t xml:space="preserve">Color </w:t>
-      </w:r>
-      <w:r>
-        <w:t xml:space="preserve">object with RGB values of (254, 212, 29). </w:t>
+        <w:t xml:space="preserve"> class. Set the color to white and draw two large circles close together for the eyes. Approximate the eyes of the actual Simpsons characters to the best of your ability. </w:t>
       </w:r>
       <w:r>
         <w:br/>
@@ -1716,7 +1826,10 @@
         <w:spacing w:before="0" w:after="0"/>
       </w:pPr>
       <w:r>
-        <w:t>There is no hair</w:t>
+        <w:t>T</w:t>
+      </w:r>
+      <w:r>
+        <w:t>he eye color is black and in the center of the large white parts</w:t>
       </w:r>
     </w:p>
     <w:p>
@@ -1729,7 +1842,7 @@
         <w:spacing w:before="0" w:after="0"/>
       </w:pPr>
       <w:r>
-        <w:t xml:space="preserve">Do this by overriding the </w:t>
+        <w:t xml:space="preserve">Override the </w:t>
       </w:r>
       <w:proofErr w:type="spellStart"/>
       <w:r>
@@ -1737,11 +1850,51 @@
           <w:rFonts w:ascii="Courier New" w:hAnsi="Courier New" w:cs="Courier New"/>
           <w:sz w:val="20"/>
         </w:rPr>
-        <w:t>drawHair</w:t>
-      </w:r>
-      <w:proofErr w:type="spellEnd"/>
-      <w:r>
-        <w:t xml:space="preserve"> method. </w:t>
+        <w:t>eyeColor</w:t>
+      </w:r>
+      <w:proofErr w:type="spellEnd"/>
+      <w:r>
+        <w:t xml:space="preserve"> method</w:t>
+      </w:r>
+      <w:r>
+        <w:t>.</w:t>
+      </w:r>
+    </w:p>
+    <w:p>
+      <w:pPr>
+        <w:pStyle w:val="NormalWeb"/>
+        <w:numPr>
+          <w:ilvl w:val="1"/>
+          <w:numId w:val="19"/>
+        </w:numPr>
+        <w:spacing w:before="0" w:after="0"/>
+      </w:pPr>
+      <w:r>
+        <w:t xml:space="preserve">Override the </w:t>
+      </w:r>
+      <w:proofErr w:type="spellStart"/>
+      <w:r>
+        <w:rPr>
+          <w:rFonts w:ascii="Courier New" w:hAnsi="Courier New" w:cs="Courier New"/>
+          <w:sz w:val="20"/>
+        </w:rPr>
+        <w:t>drawEyeCenters</w:t>
+      </w:r>
+      <w:proofErr w:type="spellEnd"/>
+      <w:r>
+        <w:t xml:space="preserve"> method. Use the </w:t>
+      </w:r>
+      <w:proofErr w:type="spellStart"/>
+      <w:r>
+        <w:rPr>
+          <w:rFonts w:ascii="Courier New" w:hAnsi="Courier New" w:cs="Courier New"/>
+          <w:sz w:val="20"/>
+        </w:rPr>
+        <w:t>eyeColor</w:t>
+      </w:r>
+      <w:proofErr w:type="spellEnd"/>
+      <w:r>
+        <w:t xml:space="preserve"> method to set the color. </w:t>
       </w:r>
       <w:r>
         <w:br/>
@@ -1757,7 +1910,13 @@
         <w:spacing w:before="0" w:after="0"/>
       </w:pPr>
       <w:r>
-        <w:t>The eye whites are much larger and close together</w:t>
+        <w:t xml:space="preserve">The nose is black and a </w:t>
+      </w:r>
+      <w:r>
+        <w:t>different</w:t>
+      </w:r>
+      <w:r>
+        <w:t xml:space="preserve"> shape</w:t>
       </w:r>
     </w:p>
     <w:p>
@@ -1778,46 +1937,21 @@
           <w:rFonts w:ascii="Courier New" w:hAnsi="Courier New" w:cs="Courier New"/>
           <w:sz w:val="20"/>
         </w:rPr>
-        <w:t>drawEyeWhites</w:t>
-      </w:r>
-      <w:proofErr w:type="spellEnd"/>
-      <w:r>
-        <w:t xml:space="preserve"> method </w:t>
-      </w:r>
-      <w:r>
-        <w:t>from</w:t>
-      </w:r>
-      <w:r>
-        <w:t xml:space="preserve"> the </w:t>
+        <w:t>nose</w:t>
       </w:r>
       <w:r>
         <w:rPr>
           <w:rFonts w:ascii="Courier New" w:hAnsi="Courier New" w:cs="Courier New"/>
           <w:sz w:val="20"/>
         </w:rPr>
-        <w:t>Face</w:t>
-      </w:r>
-      <w:r>
-        <w:t xml:space="preserve"> class. Set the color to white and draw two large circles close together for the eyes. Approximate the eyes of the actual Simpsons characters to the best of your ability. </w:t>
-      </w:r>
-      <w:r>
-        <w:br/>
-      </w:r>
-    </w:p>
-    <w:p>
-      <w:pPr>
-        <w:pStyle w:val="NormalWeb"/>
-        <w:numPr>
-          <w:ilvl w:val="0"/>
-          <w:numId w:val="19"/>
-        </w:numPr>
-        <w:spacing w:before="0" w:after="0"/>
-      </w:pPr>
-      <w:r>
-        <w:t>T</w:t>
-      </w:r>
-      <w:r>
-        <w:t>he eye color is black and in the center of the large white parts</w:t>
+        <w:t>Color</w:t>
+      </w:r>
+      <w:proofErr w:type="spellEnd"/>
+      <w:r>
+        <w:t xml:space="preserve"> method</w:t>
+      </w:r>
+      <w:r>
+        <w:t>.</w:t>
       </w:r>
     </w:p>
     <w:p>
@@ -1838,128 +1972,6 @@
           <w:rFonts w:ascii="Courier New" w:hAnsi="Courier New" w:cs="Courier New"/>
           <w:sz w:val="20"/>
         </w:rPr>
-        <w:t>eyeColor</w:t>
-      </w:r>
-      <w:proofErr w:type="spellEnd"/>
-      <w:r>
-        <w:t xml:space="preserve"> method</w:t>
-      </w:r>
-      <w:r>
-        <w:t>.</w:t>
-      </w:r>
-    </w:p>
-    <w:p>
-      <w:pPr>
-        <w:pStyle w:val="NormalWeb"/>
-        <w:numPr>
-          <w:ilvl w:val="1"/>
-          <w:numId w:val="19"/>
-        </w:numPr>
-        <w:spacing w:before="0" w:after="0"/>
-      </w:pPr>
-      <w:r>
-        <w:t xml:space="preserve">Override the </w:t>
-      </w:r>
-      <w:proofErr w:type="spellStart"/>
-      <w:r>
-        <w:rPr>
-          <w:rFonts w:ascii="Courier New" w:hAnsi="Courier New" w:cs="Courier New"/>
-          <w:sz w:val="20"/>
-        </w:rPr>
-        <w:t>drawEyeCenters</w:t>
-      </w:r>
-      <w:proofErr w:type="spellEnd"/>
-      <w:r>
-        <w:t xml:space="preserve"> method. Use the </w:t>
-      </w:r>
-      <w:proofErr w:type="spellStart"/>
-      <w:r>
-        <w:rPr>
-          <w:rFonts w:ascii="Courier New" w:hAnsi="Courier New" w:cs="Courier New"/>
-          <w:sz w:val="20"/>
-        </w:rPr>
-        <w:t>eyeColor</w:t>
-      </w:r>
-      <w:proofErr w:type="spellEnd"/>
-      <w:r>
-        <w:t xml:space="preserve"> method to set the color. </w:t>
-      </w:r>
-      <w:r>
-        <w:br/>
-      </w:r>
-    </w:p>
-    <w:p>
-      <w:pPr>
-        <w:pStyle w:val="NormalWeb"/>
-        <w:numPr>
-          <w:ilvl w:val="0"/>
-          <w:numId w:val="19"/>
-        </w:numPr>
-        <w:spacing w:before="0" w:after="0"/>
-      </w:pPr>
-      <w:r>
-        <w:t xml:space="preserve">The nose is black and a </w:t>
-      </w:r>
-      <w:r>
-        <w:t>different</w:t>
-      </w:r>
-      <w:r>
-        <w:t xml:space="preserve"> shape</w:t>
-      </w:r>
-    </w:p>
-    <w:p>
-      <w:pPr>
-        <w:pStyle w:val="NormalWeb"/>
-        <w:numPr>
-          <w:ilvl w:val="1"/>
-          <w:numId w:val="19"/>
-        </w:numPr>
-        <w:spacing w:before="0" w:after="0"/>
-      </w:pPr>
-      <w:r>
-        <w:t xml:space="preserve">Override the </w:t>
-      </w:r>
-      <w:proofErr w:type="spellStart"/>
-      <w:r>
-        <w:rPr>
-          <w:rFonts w:ascii="Courier New" w:hAnsi="Courier New" w:cs="Courier New"/>
-          <w:sz w:val="20"/>
-        </w:rPr>
-        <w:t>nose</w:t>
-      </w:r>
-      <w:r>
-        <w:rPr>
-          <w:rFonts w:ascii="Courier New" w:hAnsi="Courier New" w:cs="Courier New"/>
-          <w:sz w:val="20"/>
-        </w:rPr>
-        <w:t>Color</w:t>
-      </w:r>
-      <w:proofErr w:type="spellEnd"/>
-      <w:r>
-        <w:t xml:space="preserve"> method</w:t>
-      </w:r>
-      <w:r>
-        <w:t>.</w:t>
-      </w:r>
-    </w:p>
-    <w:p>
-      <w:pPr>
-        <w:pStyle w:val="NormalWeb"/>
-        <w:numPr>
-          <w:ilvl w:val="1"/>
-          <w:numId w:val="19"/>
-        </w:numPr>
-        <w:spacing w:before="0" w:after="0"/>
-      </w:pPr>
-      <w:r>
-        <w:t xml:space="preserve">Override the </w:t>
-      </w:r>
-      <w:proofErr w:type="spellStart"/>
-      <w:r>
-        <w:rPr>
-          <w:rFonts w:ascii="Courier New" w:hAnsi="Courier New" w:cs="Courier New"/>
-          <w:sz w:val="20"/>
-        </w:rPr>
         <w:t>drawNose</w:t>
       </w:r>
       <w:proofErr w:type="spellEnd"/>
@@ -2083,6 +2095,7 @@
         <w:rPr>
           <w:rFonts w:ascii="Times" w:hAnsi="Times"/>
         </w:rPr>
+        <w:lastRenderedPageBreak/>
         <w:t xml:space="preserve">Part 3: Create </w:t>
       </w:r>
       <w:r>
@@ -2236,14 +2249,36 @@
       </w:r>
       <w:proofErr w:type="spellStart"/>
       <w:r>
+        <w:rPr>
+          <w:rFonts w:ascii="Courier New" w:hAnsi="Courier New" w:cs="Courier New"/>
+        </w:rPr>
         <w:t>SimpsonFace</w:t>
       </w:r>
       <w:proofErr w:type="spellEnd"/>
       <w:r>
-        <w:t xml:space="preserve"> smile. Perhaps you could leverage</w:t>
-      </w:r>
-      <w:r>
-        <w:t xml:space="preserve"> inheritance there. </w:t>
+        <w:t xml:space="preserve"> smile</w:t>
+      </w:r>
+      <w:r>
+        <w:t xml:space="preserve">, so use </w:t>
+      </w:r>
+      <w:proofErr w:type="spellStart"/>
+      <w:proofErr w:type="gramStart"/>
+      <w:r>
+        <w:rPr>
+          <w:rFonts w:ascii="Courier New" w:hAnsi="Courier New" w:cs="Courier New"/>
+        </w:rPr>
+        <w:t>super.drawMouth</w:t>
+      </w:r>
+      <w:proofErr w:type="spellEnd"/>
+      <w:proofErr w:type="gramEnd"/>
+      <w:r>
+        <w:rPr>
+          <w:rFonts w:ascii="Courier New" w:hAnsi="Courier New" w:cs="Courier New"/>
+        </w:rPr>
+        <w:t>()</w:t>
+      </w:r>
+      <w:r>
+        <w:t xml:space="preserve">. </w:t>
       </w:r>
     </w:p>
     <w:p>
@@ -2829,6 +2864,7 @@
         <w:rPr>
           <w:rFonts w:ascii="Times" w:hAnsi="Times"/>
         </w:rPr>
+        <w:lastRenderedPageBreak/>
         <w:t>EC</w:t>
       </w:r>
       <w:r>
@@ -3571,7 +3607,7 @@
         <w:rFonts w:hint="default"/>
       </w:rPr>
     </w:lvl>
-    <w:lvl w:ilvl="1" w:tplc="04090019" w:tentative="1">
+    <w:lvl w:ilvl="1" w:tplc="04090019">
       <w:start w:val="1"/>
       <w:numFmt w:val="lowerLetter"/>
       <w:lvlText w:val="%2."/>
@@ -4123,9 +4159,9 @@
       <w:lvlJc w:val="left"/>
       <w:pPr>
         <w:tabs>
-          <w:tab w:val="num" w:pos="720"/>
-        </w:tabs>
-        <w:ind w:left="720" w:hanging="360"/>
+          <w:tab w:val="num" w:pos="1080"/>
+        </w:tabs>
+        <w:ind w:left="1080" w:hanging="360"/>
       </w:pPr>
     </w:lvl>
     <w:lvl w:ilvl="1" w:tplc="00190409" w:tentative="1">
@@ -4135,9 +4171,9 @@
       <w:lvlJc w:val="left"/>
       <w:pPr>
         <w:tabs>
-          <w:tab w:val="num" w:pos="1440"/>
-        </w:tabs>
-        <w:ind w:left="1440" w:hanging="360"/>
+          <w:tab w:val="num" w:pos="1800"/>
+        </w:tabs>
+        <w:ind w:left="1800" w:hanging="360"/>
       </w:pPr>
     </w:lvl>
     <w:lvl w:ilvl="2" w:tplc="001B0409" w:tentative="1">
@@ -4147,9 +4183,9 @@
       <w:lvlJc w:val="right"/>
       <w:pPr>
         <w:tabs>
-          <w:tab w:val="num" w:pos="2160"/>
-        </w:tabs>
-        <w:ind w:left="2160" w:hanging="180"/>
+          <w:tab w:val="num" w:pos="2520"/>
+        </w:tabs>
+        <w:ind w:left="2520" w:hanging="180"/>
       </w:pPr>
     </w:lvl>
     <w:lvl w:ilvl="3" w:tplc="000F0409" w:tentative="1">
@@ -4159,9 +4195,9 @@
       <w:lvlJc w:val="left"/>
       <w:pPr>
         <w:tabs>
-          <w:tab w:val="num" w:pos="2880"/>
-        </w:tabs>
-        <w:ind w:left="2880" w:hanging="360"/>
+          <w:tab w:val="num" w:pos="3240"/>
+        </w:tabs>
+        <w:ind w:left="3240" w:hanging="360"/>
       </w:pPr>
     </w:lvl>
     <w:lvl w:ilvl="4" w:tplc="00190409" w:tentative="1">
@@ -4171,9 +4207,9 @@
       <w:lvlJc w:val="left"/>
       <w:pPr>
         <w:tabs>
-          <w:tab w:val="num" w:pos="3600"/>
-        </w:tabs>
-        <w:ind w:left="3600" w:hanging="360"/>
+          <w:tab w:val="num" w:pos="3960"/>
+        </w:tabs>
+        <w:ind w:left="3960" w:hanging="360"/>
       </w:pPr>
     </w:lvl>
     <w:lvl w:ilvl="5" w:tplc="001B0409" w:tentative="1">
@@ -4183,9 +4219,9 @@
       <w:lvlJc w:val="right"/>
       <w:pPr>
         <w:tabs>
-          <w:tab w:val="num" w:pos="4320"/>
-        </w:tabs>
-        <w:ind w:left="4320" w:hanging="180"/>
+          <w:tab w:val="num" w:pos="4680"/>
+        </w:tabs>
+        <w:ind w:left="4680" w:hanging="180"/>
       </w:pPr>
     </w:lvl>
     <w:lvl w:ilvl="6" w:tplc="000F0409" w:tentative="1">
@@ -4195,9 +4231,9 @@
       <w:lvlJc w:val="left"/>
       <w:pPr>
         <w:tabs>
-          <w:tab w:val="num" w:pos="5040"/>
-        </w:tabs>
-        <w:ind w:left="5040" w:hanging="360"/>
+          <w:tab w:val="num" w:pos="5400"/>
+        </w:tabs>
+        <w:ind w:left="5400" w:hanging="360"/>
       </w:pPr>
     </w:lvl>
     <w:lvl w:ilvl="7" w:tplc="00190409" w:tentative="1">
@@ -4207,9 +4243,9 @@
       <w:lvlJc w:val="left"/>
       <w:pPr>
         <w:tabs>
-          <w:tab w:val="num" w:pos="5760"/>
-        </w:tabs>
-        <w:ind w:left="5760" w:hanging="360"/>
+          <w:tab w:val="num" w:pos="6120"/>
+        </w:tabs>
+        <w:ind w:left="6120" w:hanging="360"/>
       </w:pPr>
     </w:lvl>
     <w:lvl w:ilvl="8" w:tplc="001B0409" w:tentative="1">
@@ -4219,9 +4255,9 @@
       <w:lvlJc w:val="right"/>
       <w:pPr>
         <w:tabs>
-          <w:tab w:val="num" w:pos="6480"/>
-        </w:tabs>
-        <w:ind w:left="6480" w:hanging="180"/>
+          <w:tab w:val="num" w:pos="6840"/>
+        </w:tabs>
+        <w:ind w:left="6840" w:hanging="180"/>
       </w:pPr>
     </w:lvl>
   </w:abstractNum>

</xml_diff>

<commit_message>
Add checkpoint showing them some polymorphism in FaceFrame.java.
</commit_message>
<xml_diff>
--- a/Lab 10 - Inheritance.docx
+++ b/Lab 10 - Inheritance.docx
@@ -286,7 +286,6 @@
         <w:t xml:space="preserve"> The axes drawn by </w:t>
       </w:r>
       <w:proofErr w:type="spellStart"/>
-      <w:proofErr w:type="gramStart"/>
       <w:r>
         <w:rPr>
           <w:rStyle w:val="HTMLTypewriter"/>
@@ -298,14 +297,7 @@
         <w:rPr>
           <w:rStyle w:val="HTMLTypewriter"/>
         </w:rPr>
-        <w:t>(</w:t>
-      </w:r>
-      <w:proofErr w:type="gramEnd"/>
-      <w:r>
-        <w:rPr>
-          <w:rStyle w:val="HTMLTypewriter"/>
-        </w:rPr>
-        <w:t>)</w:t>
+        <w:t>()</w:t>
       </w:r>
       <w:r>
         <w:t xml:space="preserve"> show the coordinates that those methods use. </w:t>
@@ -1377,15 +1369,7 @@
         <w:t>Polygon2</w:t>
       </w:r>
       <w:r>
-        <w:t xml:space="preserve"> class </w:t>
-      </w:r>
-      <w:proofErr w:type="gramStart"/>
-      <w:r>
-        <w:t>with regard to</w:t>
-      </w:r>
-      <w:proofErr w:type="gramEnd"/>
-      <w:r>
-        <w:t xml:space="preserve"> the constructor and methods to scale and rotate the </w:t>
+        <w:t xml:space="preserve"> class with regard to the constructor and methods to scale and rotate the </w:t>
       </w:r>
       <w:r>
         <w:rPr>
@@ -1398,7 +1382,6 @@
         <w:t xml:space="preserve"> object.) The object returned should fit in the face. Recall that the method call </w:t>
       </w:r>
       <w:proofErr w:type="spellStart"/>
-      <w:proofErr w:type="gramStart"/>
       <w:r>
         <w:rPr>
           <w:rFonts w:ascii="Courier New" w:hAnsi="Courier New"/>
@@ -1412,15 +1395,7 @@
           <w:rFonts w:ascii="Courier New" w:hAnsi="Courier New"/>
           <w:sz w:val="20"/>
         </w:rPr>
-        <w:t>(</w:t>
-      </w:r>
-      <w:proofErr w:type="gramEnd"/>
-      <w:r>
-        <w:rPr>
-          <w:rFonts w:ascii="Courier New" w:hAnsi="Courier New"/>
-          <w:sz w:val="20"/>
-        </w:rPr>
-        <w:t>20)</w:t>
+        <w:t>(20)</w:t>
       </w:r>
       <w:r>
         <w:t xml:space="preserve"> returns the </w:t>
@@ -1560,7 +1535,6 @@
         <w:t xml:space="preserve"> class should set the color of the graphics pen to </w:t>
       </w:r>
       <w:proofErr w:type="spellStart"/>
-      <w:proofErr w:type="gramStart"/>
       <w:r>
         <w:rPr>
           <w:rFonts w:ascii="Courier New" w:hAnsi="Courier New"/>
@@ -1569,7 +1543,6 @@
         <w:t>this.mouthColor</w:t>
       </w:r>
       <w:proofErr w:type="spellEnd"/>
-      <w:proofErr w:type="gramEnd"/>
       <w:r>
         <w:rPr>
           <w:rFonts w:ascii="Courier New" w:hAnsi="Courier New"/>
@@ -1591,7 +1564,6 @@
         <w:t xml:space="preserve"> variable and assign it to the result of calling </w:t>
       </w:r>
       <w:proofErr w:type="spellStart"/>
-      <w:proofErr w:type="gramStart"/>
       <w:r>
         <w:rPr>
           <w:rFonts w:ascii="Courier New" w:hAnsi="Courier New"/>
@@ -1605,15 +1577,7 @@
           <w:rFonts w:ascii="Courier New" w:hAnsi="Courier New"/>
           <w:sz w:val="20"/>
         </w:rPr>
-        <w:t>(</w:t>
-      </w:r>
-      <w:proofErr w:type="gramEnd"/>
-      <w:r>
-        <w:rPr>
-          <w:rFonts w:ascii="Courier New" w:hAnsi="Courier New"/>
-          <w:sz w:val="20"/>
-        </w:rPr>
-        <w:t>)</w:t>
+        <w:t>()</w:t>
       </w:r>
       <w:r>
         <w:t xml:space="preserve">. Finally, the method should draw the mouth to the </w:t>
@@ -2262,7 +2226,6 @@
         <w:t xml:space="preserve">, so use </w:t>
       </w:r>
       <w:proofErr w:type="spellStart"/>
-      <w:proofErr w:type="gramStart"/>
       <w:r>
         <w:rPr>
           <w:rFonts w:ascii="Courier New" w:hAnsi="Courier New" w:cs="Courier New"/>
@@ -2270,7 +2233,6 @@
         <w:t>super.drawMouth</w:t>
       </w:r>
       <w:proofErr w:type="spellEnd"/>
-      <w:proofErr w:type="gramEnd"/>
       <w:r>
         <w:rPr>
           <w:rFonts w:ascii="Courier New" w:hAnsi="Courier New" w:cs="Courier New"/>
@@ -2356,7 +2318,279 @@
         <w:rPr>
           <w:rFonts w:ascii="Times" w:hAnsi="Times"/>
         </w:rPr>
-        <w:t xml:space="preserve">Part 4: Create </w:t>
+        <w:t>Part 4:</w:t>
+      </w:r>
+      <w:r>
+        <w:rPr>
+          <w:rFonts w:ascii="Times" w:hAnsi="Times"/>
+        </w:rPr>
+        <w:t xml:space="preserve"> Preview of Polymorphism </w:t>
+      </w:r>
+      <w:r>
+        <w:rPr>
+          <w:rFonts w:ascii="Times" w:hAnsi="Times"/>
+        </w:rPr>
+        <w:t xml:space="preserve"> </w:t>
+      </w:r>
+    </w:p>
+    <w:p>
+      <w:pPr>
+        <w:pStyle w:val="NormalWeb"/>
+        <w:spacing w:before="0" w:after="0"/>
+      </w:pPr>
+      <w:r>
+        <w:t>Answer the following questions to help you understand polymorphism</w:t>
+      </w:r>
+      <w:r>
+        <w:t xml:space="preserve">: </w:t>
+      </w:r>
+    </w:p>
+    <w:p>
+      <w:pPr>
+        <w:pStyle w:val="NormalWeb"/>
+        <w:numPr>
+          <w:ilvl w:val="2"/>
+          <w:numId w:val="6"/>
+        </w:numPr>
+        <w:spacing w:before="0" w:after="0"/>
+      </w:pPr>
+      <w:r>
+        <w:t xml:space="preserve">In the </w:t>
+      </w:r>
+      <w:proofErr w:type="spellStart"/>
+      <w:r>
+        <w:rPr>
+          <w:rFonts w:ascii="Courier New" w:hAnsi="Courier New" w:cs="Courier New"/>
+        </w:rPr>
+        <w:t>FaceFrame</w:t>
+      </w:r>
+      <w:proofErr w:type="spellEnd"/>
+      <w:r>
+        <w:t xml:space="preserve"> class, what is the type of </w:t>
+      </w:r>
+      <w:r>
+        <w:t xml:space="preserve">the </w:t>
+      </w:r>
+      <w:r>
+        <w:rPr>
+          <w:rFonts w:ascii="Courier New" w:hAnsi="Courier New" w:cs="Courier New"/>
+        </w:rPr>
+        <w:t>faces</w:t>
+      </w:r>
+      <w:r>
+        <w:t xml:space="preserve"> instance variable</w:t>
+      </w:r>
+      <w:r>
+        <w:t xml:space="preserve">? (Hint: look at where it is declared.) </w:t>
+      </w:r>
+    </w:p>
+    <w:p>
+      <w:pPr>
+        <w:pStyle w:val="NormalWeb"/>
+        <w:numPr>
+          <w:ilvl w:val="2"/>
+          <w:numId w:val="6"/>
+        </w:numPr>
+        <w:spacing w:before="0" w:after="0"/>
+      </w:pPr>
+      <w:r>
+        <w:t xml:space="preserve">In the </w:t>
+      </w:r>
+      <w:proofErr w:type="spellStart"/>
+      <w:r>
+        <w:rPr>
+          <w:rFonts w:ascii="Courier New" w:hAnsi="Courier New" w:cs="Courier New"/>
+        </w:rPr>
+        <w:t>FaceFrame</w:t>
+      </w:r>
+      <w:proofErr w:type="spellEnd"/>
+      <w:r>
+        <w:t xml:space="preserve"> class, what is the actual type of each object loaded into the </w:t>
+      </w:r>
+      <w:r>
+        <w:rPr>
+          <w:rFonts w:ascii="Courier New" w:hAnsi="Courier New" w:cs="Courier New"/>
+        </w:rPr>
+        <w:t>faces</w:t>
+      </w:r>
+      <w:r>
+        <w:t xml:space="preserve"> instance variable? </w:t>
+      </w:r>
+    </w:p>
+    <w:p>
+      <w:pPr>
+        <w:pStyle w:val="NormalWeb"/>
+        <w:numPr>
+          <w:ilvl w:val="2"/>
+          <w:numId w:val="6"/>
+        </w:numPr>
+        <w:spacing w:before="0" w:after="0"/>
+      </w:pPr>
+      <w:r>
+        <w:t xml:space="preserve">In the </w:t>
+      </w:r>
+      <w:proofErr w:type="spellStart"/>
+      <w:r>
+        <w:rPr>
+          <w:rFonts w:ascii="Courier New" w:hAnsi="Courier New" w:cs="Courier New"/>
+        </w:rPr>
+        <w:t>FaceFrame</w:t>
+      </w:r>
+      <w:proofErr w:type="spellEnd"/>
+      <w:r>
+        <w:t xml:space="preserve"> class, </w:t>
+      </w:r>
+      <w:r>
+        <w:t xml:space="preserve">go to the </w:t>
+      </w:r>
+      <w:r>
+        <w:rPr>
+          <w:rFonts w:ascii="Courier New" w:hAnsi="Courier New" w:cs="Courier New"/>
+        </w:rPr>
+        <w:t>paint</w:t>
+      </w:r>
+      <w:r>
+        <w:t xml:space="preserve"> method and find where the </w:t>
+      </w:r>
+      <w:proofErr w:type="spellStart"/>
+      <w:r>
+        <w:rPr>
+          <w:rFonts w:ascii="Courier New" w:hAnsi="Courier New" w:cs="Courier New"/>
+        </w:rPr>
+        <w:t>drawOn</w:t>
+      </w:r>
+      <w:proofErr w:type="spellEnd"/>
+      <w:r>
+        <w:t xml:space="preserve"> method is called on </w:t>
+      </w:r>
+      <w:r>
+        <w:rPr>
+          <w:rFonts w:ascii="Courier New" w:hAnsi="Courier New" w:cs="Courier New"/>
+        </w:rPr>
+        <w:t>faces[</w:t>
+      </w:r>
+      <w:proofErr w:type="spellStart"/>
+      <w:r>
+        <w:rPr>
+          <w:rFonts w:ascii="Courier New" w:hAnsi="Courier New" w:cs="Courier New"/>
+        </w:rPr>
+        <w:t>i</w:t>
+      </w:r>
+      <w:proofErr w:type="spellEnd"/>
+      <w:r>
+        <w:rPr>
+          <w:rFonts w:ascii="Courier New" w:hAnsi="Courier New" w:cs="Courier New"/>
+        </w:rPr>
+        <w:t>]</w:t>
+      </w:r>
+      <w:r>
+        <w:t xml:space="preserve">. What file will Java look in to find the code for this call to </w:t>
+      </w:r>
+      <w:proofErr w:type="spellStart"/>
+      <w:r>
+        <w:rPr>
+          <w:rFonts w:ascii="Courier New" w:hAnsi="Courier New" w:cs="Courier New"/>
+        </w:rPr>
+        <w:t>drawOn</w:t>
+      </w:r>
+      <w:proofErr w:type="spellEnd"/>
+      <w:r>
+        <w:t xml:space="preserve">? (Hint: it depends whether </w:t>
+      </w:r>
+      <w:proofErr w:type="spellStart"/>
+      <w:r>
+        <w:rPr>
+          <w:rFonts w:ascii="Courier New" w:hAnsi="Courier New" w:cs="Courier New"/>
+        </w:rPr>
+        <w:t>drawOn</w:t>
+      </w:r>
+      <w:proofErr w:type="spellEnd"/>
+      <w:r>
+        <w:t xml:space="preserve"> has been overridden.) </w:t>
+      </w:r>
+    </w:p>
+    <w:p>
+      <w:pPr>
+        <w:pStyle w:val="NormalWeb"/>
+        <w:spacing w:before="0" w:after="0"/>
+        <w:rPr>
+          <w:i/>
+        </w:rPr>
+      </w:pPr>
+      <w:r>
+        <w:rPr>
+          <w:b/>
+          <w:u w:val="single"/>
+        </w:rPr>
+        <w:t>checkpoint 4 (</w:t>
+      </w:r>
+      <w:r>
+        <w:rPr>
+          <w:b/>
+          <w:u w:val="single"/>
+        </w:rPr>
+        <w:t>1</w:t>
+      </w:r>
+      <w:r>
+        <w:rPr>
+          <w:b/>
+          <w:u w:val="single"/>
+        </w:rPr>
+        <w:t>0 points):</w:t>
+      </w:r>
+      <w:r>
+        <w:rPr>
+          <w:b/>
+        </w:rPr>
+        <w:t xml:space="preserve"> </w:t>
+      </w:r>
+      <w:r>
+        <w:rPr>
+          <w:b/>
+        </w:rPr>
+        <w:t xml:space="preserve">Explain your answers to the lab instructor or assistant. </w:t>
+      </w:r>
+      <w:r>
+        <w:rPr>
+          <w:b/>
+        </w:rPr>
+        <w:t xml:space="preserve"> </w:t>
+      </w:r>
+    </w:p>
+    <w:p>
+      <w:pPr>
+        <w:pStyle w:val="Heading3"/>
+        <w:spacing w:before="0" w:after="0"/>
+        <w:rPr>
+          <w:rFonts w:ascii="Times" w:hAnsi="Times"/>
+        </w:rPr>
+      </w:pPr>
+    </w:p>
+    <w:p>
+      <w:pPr>
+        <w:pStyle w:val="Heading3"/>
+        <w:spacing w:before="0" w:after="0"/>
+        <w:rPr>
+          <w:rFonts w:ascii="Times" w:hAnsi="Times"/>
+        </w:rPr>
+      </w:pPr>
+      <w:r>
+        <w:rPr>
+          <w:rFonts w:ascii="Times" w:hAnsi="Times"/>
+        </w:rPr>
+        <w:t xml:space="preserve">Part </w:t>
+      </w:r>
+      <w:r>
+        <w:rPr>
+          <w:rFonts w:ascii="Times" w:hAnsi="Times"/>
+        </w:rPr>
+        <w:t>5</w:t>
+      </w:r>
+      <w:r>
+        <w:rPr>
+          <w:rFonts w:ascii="Times" w:hAnsi="Times"/>
+        </w:rPr>
+        <w:t xml:space="preserve">: Create </w:t>
       </w:r>
       <w:r>
         <w:rPr>
@@ -2505,33 +2739,65 @@
           <w:b/>
           <w:u w:val="single"/>
         </w:rPr>
-        <w:t>checkpoint 4 (</w:t>
+        <w:t xml:space="preserve">checkpoint </w:t>
       </w:r>
       <w:r>
         <w:rPr>
           <w:b/>
           <w:u w:val="single"/>
         </w:rPr>
-        <w:t>2</w:t>
+        <w:t>5</w:t>
       </w:r>
       <w:r>
         <w:rPr>
           <w:b/>
           <w:u w:val="single"/>
         </w:rPr>
+        <w:t xml:space="preserve"> (</w:t>
+      </w:r>
+      <w:r>
+        <w:rPr>
+          <w:b/>
+          <w:u w:val="single"/>
+        </w:rPr>
+        <w:t>1</w:t>
+      </w:r>
+      <w:r>
+        <w:rPr>
+          <w:b/>
+          <w:u w:val="single"/>
+        </w:rPr>
         <w:t>0 points):</w:t>
       </w:r>
       <w:r>
         <w:rPr>
           <w:b/>
         </w:rPr>
-        <w:t xml:space="preserve"> Show your lab instructor or assistant that </w:t>
-      </w:r>
-      <w:r>
-        <w:rPr>
-          <w:b/>
-        </w:rPr>
-        <w:t xml:space="preserve">Marge’s face </w:t>
+        <w:t xml:space="preserve"> Show your lab instructor or assistant</w:t>
+      </w:r>
+      <w:r>
+        <w:rPr>
+          <w:b/>
+        </w:rPr>
+        <w:t xml:space="preserve"> your rendition of</w:t>
+      </w:r>
+      <w:r>
+        <w:rPr>
+          <w:b/>
+        </w:rPr>
+        <w:t xml:space="preserve"> </w:t>
+      </w:r>
+      <w:r>
+        <w:rPr>
+          <w:b/>
+        </w:rPr>
+        <w:t>Marge’s face</w:t>
+      </w:r>
+      <w:r>
+        <w:rPr>
+          <w:b/>
+        </w:rPr>
+        <w:t>.</w:t>
       </w:r>
     </w:p>
     <w:p>
@@ -2540,6 +2806,7 @@
         <w:spacing w:before="0" w:after="0"/>
       </w:pPr>
       <w:r>
+        <w:lastRenderedPageBreak/>
         <w:t xml:space="preserve"> </w:t>
       </w:r>
     </w:p>
@@ -2864,7 +3131,6 @@
         <w:rPr>
           <w:rFonts w:ascii="Times" w:hAnsi="Times"/>
         </w:rPr>
-        <w:lastRenderedPageBreak/>
         <w:t>EC</w:t>
       </w:r>
       <w:r>

</xml_diff>